<commit_message>
Close mechanical annotation gaps
</commit_message>
<xml_diff>
--- a/1952.1/1952年1月22日，关于宣传文教部门应无例外地进行“三反”运动的指示__LLM初注.docx
+++ b/1952.1/1952年1月22日，关于宣传文教部门应无例外地进行“三反”运动的指示__LLM初注.docx
@@ -477,8 +477,13 @@
       </w:r>
     </w:p>
     <w:p>
+      <w:commentRangeStart w:id="0"/>
       <w:r>
         <w:t>1. 【需核】文中"西北局1月11日所发西北宣传文化教育部门三反运动情况的报告"的具体保存情况和建议出处需要核实。</w:t>
+      </w:r>
+      <w:commentRangeEnd w:id="0"/>
+      <w:r>
+        <w:commentReference w:id="0"/>
       </w:r>
     </w:p>
     <w:sectPr>
@@ -494,6 +499,18 @@
     </w:sectPr>
   </w:body>
 </w:document>
+</file>
+
+<file path=word/comments.xml><?xml version="1.0" encoding="utf-8"?>
+<w:comments xmlns:w="http://schemas.openxmlformats.org/wordprocessingml/2006/main">
+  <w:comment w:id="0" w:author="LLM初注待核" w:date="2026-07-05T15:07:25Z">
+    <w:p>
+      <w:r>
+        <w:t>【需核】文中"西北局1月11日所发西北宣传文化教育部门三反运动情况的报告"的具体保存情况和建议出处需要核实。</w:t>
+      </w:r>
+    </w:p>
+  </w:comment>
+</w:comments>
 </file>
 
 <file path=word/footer1.xml><?xml version="1.0" encoding="utf-8"?>

</xml_diff>

<commit_message>
Repair Word comment reference styling
</commit_message>
<xml_diff>
--- a/1952.1/1952年1月22日，关于宣传文教部门应无例外地进行“三反”运动的指示__LLM初注.docx
+++ b/1952.1/1952年1月22日，关于宣传文教部门应无例外地进行“三反”运动的指示__LLM初注.docx
@@ -483,6 +483,9 @@
       </w:r>
       <w:commentRangeEnd w:id="0"/>
       <w:r>
+        <w:rPr>
+          <w:rStyle w:val="CommentReference"/>
+        </w:rPr>
         <w:commentReference w:id="0"/>
       </w:r>
     </w:p>
@@ -505,6 +508,9 @@
 <w:comments xmlns:w="http://schemas.openxmlformats.org/wordprocessingml/2006/main">
   <w:comment w:id="0" w:author="LLM初注待核" w:date="2026-07-05T15:07:25Z">
     <w:p>
+      <w:pPr>
+        <w:pStyle w:val="CommentText"/>
+      </w:pPr>
       <w:r>
         <w:t>【需核】文中"西北局1月11日所发西北宣传文化教育部门三反运动情况的报告"的具体保存情况和建议出处需要核实。</w:t>
       </w:r>

</xml_diff>